<commit_message>
Setup card: add EDGAR and LLM extraction plan and owner
Take ownership of the press release text and LLM extraction step, add an LLM
row to the sources table, and describe the hand validation plan.
</commit_message>
<xml_diff>
--- a/submissions/setup_card.docx
+++ b/submissions/setup_card.docx
@@ -457,7 +457,75 @@
           <w:p>
             <w:pPr/>
             <w:r>
-              <w:t xml:space="preserve">Abhi</w:t>
+              <w:t>Abhi (filing list), Xueyun (press release text)</w:t>
+            </w:r>
+          </w:p>
+        </w:tc>
+      </w:tr>
+      <w:tr>
+        <w:tc>
+          <w:tcPr>
+            <w:tcW w:w="1560" w:type="dxa"/>
+          </w:tcPr>
+          <w:p>
+            <w:pPr/>
+            <w:r>
+              <w:t>LLM (press release extraction)</w:t>
+            </w:r>
+          </w:p>
+        </w:tc>
+        <w:tc>
+          <w:tcPr>
+            <w:tcW w:w="1560" w:type="dxa"/>
+          </w:tcPr>
+          <w:p>
+            <w:pPr/>
+            <w:r>
+              <w:t>Announcement date and before open or after close, from Exhibit 99.1</w:t>
+            </w:r>
+          </w:p>
+        </w:tc>
+        <w:tc>
+          <w:tcPr>
+            <w:tcW w:w="1560" w:type="dxa"/>
+          </w:tcPr>
+          <w:p>
+            <w:pPr/>
+            <w:r>
+              <w:t>API key needed, cost tracked</w:t>
+            </w:r>
+          </w:p>
+        </w:tc>
+        <w:tc>
+          <w:tcPr>
+            <w:tcW w:w="1560" w:type="dxa"/>
+          </w:tcPr>
+          <w:p>
+            <w:pPr/>
+            <w:r>
+              <w:t>EDGAR accession</w:t>
+            </w:r>
+          </w:p>
+        </w:tc>
+        <w:tc>
+          <w:tcPr>
+            <w:tcW w:w="1560" w:type="dxa"/>
+          </w:tcPr>
+          <w:p>
+            <w:pPr/>
+            <w:r>
+              <w:t>Not yet, prompt drafted by Oct 21</w:t>
+            </w:r>
+          </w:p>
+        </w:tc>
+        <w:tc>
+          <w:tcPr>
+            <w:tcW w:w="1560" w:type="dxa"/>
+          </w:tcPr>
+          <w:p>
+            <w:pPr/>
+            <w:r>
+              <w:t>Xueyun</w:t>
             </w:r>
           </w:p>
         </w:tc>
@@ -959,7 +1027,7 @@
         <w:t xml:space="preserve">EDGAR and LLM extraction:</w:t>
       </w:r>
       <w:r>
-        <w:t xml:space="preserve"> filing list pulled. Press release text and the LLM extraction are not yet started, and have no owner.</w:t>
+        <w:t xml:space="preserve"> owner Xueyun. The earnings 8K filing list is pulled (773 filings, 9 of 10 pilot tickers). Next: download the Exhibit 99.1 press release text for each filing, then prompt an LLM to extract the announcement date and before open or after close, with a fixed JSON output. Validation plan: hand check a random sample of 100 releases and report the agreement rate and error types. Also compare against I/B/E/S times and EDGAR acceptance times. API cost is logged per call. No WRDS needed. Target: demo by Oct 21.</w:t>
       </w:r>
     </w:p>
     <w:sectPr>

</xml_diff>

<commit_message>
Update setup card with Loki stocks and membership
</commit_message>
<xml_diff>
--- a/submissions/setup_card.docx
+++ b/submissions/setup_card.docx
@@ -13,7 +13,7 @@
     <w:p>
       <w:pPr/>
       <w:r>
-        <w:t xml:space="preserve">Oct 5, 2026</w:t>
+        <w:t>Oct 6, 2026</w:t>
       </w:r>
     </w:p>
     <w:p>
@@ -196,64 +196,120 @@
             <w:tcW w:w="1560" w:type="dxa"/>
           </w:tcPr>
           <w:p>
-            <w:pPr/>
-            <w:r>
-              <w:t xml:space="preserve">CRSP (WRDS)</w:t>
-            </w:r>
-          </w:p>
-        </w:tc>
-        <w:tc>
-          <w:tcPr>
-            <w:tcW w:w="1560" w:type="dxa"/>
-          </w:tcPr>
-          <w:p>
-            <w:pPr/>
-            <w:r>
-              <w:t xml:space="preserve">Returns, S&amp;P 500 membership dates, corporate actions</w:t>
-            </w:r>
-          </w:p>
-        </w:tc>
-        <w:tc>
-          <w:tcPr>
-            <w:tcW w:w="1560" w:type="dxa"/>
-          </w:tcPr>
-          <w:p>
-            <w:pPr/>
-            <w:r>
-              <w:t xml:space="preserve">Reported available through Duke, table check pending</w:t>
-            </w:r>
-          </w:p>
-        </w:tc>
-        <w:tc>
-          <w:tcPr>
-            <w:tcW w:w="1560" w:type="dxa"/>
-          </w:tcPr>
-          <w:p>
-            <w:pPr/>
-            <w:r>
-              <w:t xml:space="preserve">permno</w:t>
-            </w:r>
-          </w:p>
-        </w:tc>
-        <w:tc>
-          <w:tcPr>
-            <w:tcW w:w="1560" w:type="dxa"/>
-          </w:tcPr>
-          <w:p>
-            <w:pPr/>
-            <w:r>
-              <w:t xml:space="preserve">Not yet</w:t>
-            </w:r>
-          </w:p>
-        </w:tc>
-        <w:tc>
-          <w:tcPr>
-            <w:tcW w:w="1560" w:type="dxa"/>
-          </w:tcPr>
-          <w:p>
-            <w:pPr/>
-            <w:r>
-              <w:t xml:space="preserve">Loki</w:t>
+            <w:r>
+              <w:t>CRSP (WRDS)</w:t>
+            </w:r>
+          </w:p>
+        </w:tc>
+        <w:tc>
+          <w:tcPr>
+            <w:tcW w:w="1560" w:type="dxa"/>
+          </w:tcPr>
+          <w:p>
+            <w:r>
+              <w:t>Historical S&amp;P 500 membership, dated stock IDs and corporate actions</w:t>
+            </w:r>
+          </w:p>
+        </w:tc>
+        <w:tc>
+          <w:tcPr>
+            <w:tcW w:w="1560" w:type="dxa"/>
+          </w:tcPr>
+          <w:p>
+            <w:r>
+              <w:t>WRDS account exists; CRSP table access not yet verified</w:t>
+            </w:r>
+          </w:p>
+        </w:tc>
+        <w:tc>
+          <w:tcPr>
+            <w:tcW w:w="1560" w:type="dxa"/>
+          </w:tcPr>
+          <w:p>
+            <w:r>
+              <w:t>permno and membership date intervals</w:t>
+            </w:r>
+          </w:p>
+        </w:tc>
+        <w:tc>
+          <w:tcPr>
+            <w:tcW w:w="1560" w:type="dxa"/>
+          </w:tcPr>
+          <w:p>
+            <w:r>
+              <w:t>Not yet: membership intervals and dated symbol links</w:t>
+            </w:r>
+          </w:p>
+        </w:tc>
+        <w:tc>
+          <w:tcPr>
+            <w:tcW w:w="1560" w:type="dxa"/>
+          </w:tcPr>
+          <w:p>
+            <w:r>
+              <w:t>Loki</w:t>
+            </w:r>
+          </w:p>
+        </w:tc>
+      </w:tr>
+      <w:tr>
+        <w:tc>
+          <w:tcPr>
+            <w:tcW w:type="dxa" w:w="1560"/>
+          </w:tcPr>
+          <w:p>
+            <w:r>
+              <w:t>Broker API</w:t>
+            </w:r>
+          </w:p>
+        </w:tc>
+        <w:tc>
+          <w:tcPr>
+            <w:tcW w:type="dxa" w:w="1560"/>
+          </w:tcPr>
+          <w:p>
+            <w:r>
+              <w:t>Stock prices, bid/ask quotes and volume</w:t>
+            </w:r>
+          </w:p>
+        </w:tc>
+        <w:tc>
+          <w:tcPr>
+            <w:tcW w:type="dxa" w:w="1560"/>
+          </w:tcPr>
+          <w:p>
+            <w:r>
+              <w:t>Existing collector; course pilot adaptation pending</w:t>
+            </w:r>
+          </w:p>
+        </w:tc>
+        <w:tc>
+          <w:tcPr>
+            <w:tcW w:type="dxa" w:w="1560"/>
+          </w:tcPr>
+          <w:p>
+            <w:r>
+              <w:t>Symbol and timestamp; dated permno mapping pending</w:t>
+            </w:r>
+          </w:p>
+        </w:tc>
+        <w:tc>
+          <w:tcPr>
+            <w:tcW w:type="dxa" w:w="1560"/>
+          </w:tcPr>
+          <w:p>
+            <w:r>
+              <w:t>Recent intraday data collected. Course export and 2004 onward coverage: not yet verified.</w:t>
+            </w:r>
+          </w:p>
+        </w:tc>
+        <w:tc>
+          <w:tcPr>
+            <w:tcW w:type="dxa" w:w="1560"/>
+          </w:tcPr>
+          <w:p>
+            <w:r>
+              <w:t>Loki</w:t>
             </w:r>
           </w:p>
         </w:tc>
@@ -679,6 +735,9 @@
       <w:pPr/>
       <w:r>
         <w:t xml:space="preserve">CRSP permno is the hub. Every other ID maps to it through a dated link table, so a reused ticker never silently joins two companies, and every join is made as of a date.</w:t>
+      </w:r>
+      <w:r>
+        <w:t xml:space="preserve"> Broker symbols will be matched to dated CRSP identifiers and membership on each observation date. Historical membership and the broker symbol-to-permno bridge are not yet built.</w:t>
       </w:r>
     </w:p>
     <w:tbl>
@@ -931,6 +990,48 @@
           </w:p>
         </w:tc>
       </w:tr>
+      <w:tr>
+        <w:tc>
+          <w:tcPr>
+            <w:tcW w:type="dxa" w:w="2340"/>
+          </w:tcPr>
+          <w:p>
+            <w:r>
+              <w:t>Broker stock data to CRSP</w:t>
+            </w:r>
+          </w:p>
+        </w:tc>
+        <w:tc>
+          <w:tcPr>
+            <w:tcW w:type="dxa" w:w="2340"/>
+          </w:tcPr>
+          <w:p>
+            <w:r>
+              <w:t>Symbol and timestamp</w:t>
+            </w:r>
+          </w:p>
+        </w:tc>
+        <w:tc>
+          <w:tcPr>
+            <w:tcW w:type="dxa" w:w="2340"/>
+          </w:tcPr>
+          <w:p>
+            <w:r>
+              <w:t>permno and date</w:t>
+            </w:r>
+          </w:p>
+        </w:tc>
+        <w:tc>
+          <w:tcPr>
+            <w:tcW w:type="dxa" w:w="2340"/>
+          </w:tcPr>
+          <w:p>
+            <w:r>
+              <w:t>Not yet: dated symbol-to-permno mapping required</w:t>
+            </w:r>
+          </w:p>
+        </w:tc>
+      </w:tr>
     </w:tbl>
     <w:p>
       <w:pPr>
@@ -1028,6 +1129,14 @@
       </w:r>
       <w:r>
         <w:t xml:space="preserve"> owner Xueyun. The earnings 8K filing list is pulled (773 filings, 9 of 10 pilot tickers). Next: download the Exhibit 99.1 press release text for each filing, then prompt an LLM to extract the announcement date and before open or after close, with a fixed JSON output. Validation plan: hand check a random sample of 100 releases and report the agreement rate and error types. Also compare against I/B/E/S times and EDGAR acceptance times. API cost is logged per call. No WRDS needed. Target: demo by Oct 21.</w:t>
+      </w:r>
+    </w:p>
+    <w:p>
+      <w:pPr>
+        <w:pStyle w:val="ListParagraph"/>
+      </w:pPr>
+      <w:r>
+        <w:t>Stocks and membership (Loki): broker pilot export, historical membership pull and dated identifier mapping not yet. Need agreed stocks/date range and live WRDS checks; long-history coverage remains unverified.</w:t>
       </w:r>
     </w:p>
     <w:sectPr>

</xml_diff>